<commit_message>
Update project report and README with live Vercel and GitHub repository links
</commit_message>
<xml_diff>
--- a/DERMO_SCAN_INDUSTRIAL_TRAINING_PROJECT_REPORT.docx
+++ b/DERMO_SCAN_INDUSTRIAL_TRAINING_PROJECT_REPORT.docx
@@ -2617,6 +2617,57 @@
           </w:p>
         </w:tc>
       </w:tr>
+      <w:tr>
+        <w:tc>
+          <w:tcPr>
+            <w:tcW w:type="dxa" w:w="4680"/>
+            <w:shd w:fill="F8FAFC"/>
+            <w:tcMar>
+              <w:top w:w="60" w:type="dxa"/>
+              <w:bottom w:w="60" w:type="dxa"/>
+              <w:left w:w="140" w:type="dxa"/>
+              <w:right w:w="140" w:type="dxa"/>
+            </w:tcMar>
+          </w:tcPr>
+          <w:p>
+            <w:pPr>
+              <w:spacing w:after="40"/>
+            </w:pPr>
+            <w:r>
+              <w:rPr>
+                <w:color w:val="334155"/>
+                <w:sz w:val="19"/>
+              </w:rPr>
+              <w:t xml:space="preserve">   Appendix M: Live Project Links for Interview Demonstration</w:t>
+            </w:r>
+          </w:p>
+        </w:tc>
+        <w:tc>
+          <w:tcPr>
+            <w:tcW w:type="dxa" w:w="4680"/>
+            <w:shd w:fill="F8FAFC"/>
+            <w:tcMar>
+              <w:top w:w="60" w:type="dxa"/>
+              <w:bottom w:w="60" w:type="dxa"/>
+              <w:left w:w="140" w:type="dxa"/>
+              <w:right w:w="140" w:type="dxa"/>
+            </w:tcMar>
+          </w:tcPr>
+          <w:p>
+            <w:pPr>
+              <w:spacing w:after="40"/>
+              <w:jc w:val="right"/>
+            </w:pPr>
+            <w:r>
+              <w:rPr>
+                <w:color w:val="475569"/>
+                <w:sz w:val="19"/>
+              </w:rPr>
+              <w:t>35</w:t>
+            </w:r>
+          </w:p>
+        </w:tc>
+      </w:tr>
     </w:tbl>
     <w:p>
       <w:r>
@@ -3952,6 +4003,82 @@
               <w:rPr>
                 <w:b/>
               </w:rPr>
+              <w:t>DermoScan Live Application</w:t>
+            </w:r>
+          </w:p>
+        </w:tc>
+        <w:tc>
+          <w:tcPr>
+            <w:tcW w:type="dxa" w:w="4680"/>
+            <w:tcMar>
+              <w:top w:w="60" w:type="dxa"/>
+              <w:bottom w:w="60" w:type="dxa"/>
+              <w:left w:w="120" w:type="dxa"/>
+              <w:right w:w="120" w:type="dxa"/>
+            </w:tcMar>
+          </w:tcPr>
+          <w:p>
+            <w:r>
+              <w:t>Public production deployment on Vercel: https://dermo-scan-nesn.vercel.app/</w:t>
+            </w:r>
+          </w:p>
+        </w:tc>
+      </w:tr>
+      <w:tr>
+        <w:tc>
+          <w:tcPr>
+            <w:tcW w:type="dxa" w:w="4680"/>
+            <w:shd w:fill="F8FAFC"/>
+            <w:tcMar>
+              <w:top w:w="60" w:type="dxa"/>
+              <w:bottom w:w="60" w:type="dxa"/>
+              <w:left w:w="120" w:type="dxa"/>
+              <w:right w:w="120" w:type="dxa"/>
+            </w:tcMar>
+          </w:tcPr>
+          <w:p>
+            <w:r>
+              <w:rPr>
+                <w:b/>
+              </w:rPr>
+              <w:t>DermoScan GitHub Repository</w:t>
+            </w:r>
+          </w:p>
+        </w:tc>
+        <w:tc>
+          <w:tcPr>
+            <w:tcW w:type="dxa" w:w="4680"/>
+            <w:shd w:fill="F8FAFC"/>
+            <w:tcMar>
+              <w:top w:w="60" w:type="dxa"/>
+              <w:bottom w:w="60" w:type="dxa"/>
+              <w:left w:w="120" w:type="dxa"/>
+              <w:right w:w="120" w:type="dxa"/>
+            </w:tcMar>
+          </w:tcPr>
+          <w:p>
+            <w:r>
+              <w:t>Complete project source code and architecture: https://github.com/vijayesh26/Dermo-Scan-</w:t>
+            </w:r>
+          </w:p>
+        </w:tc>
+      </w:tr>
+      <w:tr>
+        <w:tc>
+          <w:tcPr>
+            <w:tcW w:type="dxa" w:w="4680"/>
+            <w:tcMar>
+              <w:top w:w="60" w:type="dxa"/>
+              <w:bottom w:w="60" w:type="dxa"/>
+              <w:left w:w="120" w:type="dxa"/>
+              <w:right w:w="120" w:type="dxa"/>
+            </w:tcMar>
+          </w:tcPr>
+          <w:p>
+            <w:r>
+              <w:rPr>
+                <w:b/>
+              </w:rPr>
               <w:t>React Documentation</w:t>
             </w:r>
           </w:p>
@@ -4249,7 +4376,7 @@
         <w:rPr>
           <w:i/>
         </w:rPr>
-        <w:t>Project Documentation Note: Public repository links and external deployment addresses have been omitted from this report per submission requirements and can be referenced directly during project evaluation.</w:t>
+        <w:t>Project Repository &amp; Live Deployment Note: The complete source code is maintained on GitHub at https://github.com/vijayesh26/Dermo-Scan- and the production application is deployed live on Vercel at https://dermo-scan-nesn.vercel.app/ for demonstration and academic evaluation.</w:t>
       </w:r>
     </w:p>
     <w:p>
@@ -4373,6 +4500,82 @@
           <w:p>
             <w:r>
               <w:t>DERMO SCAN — Localized Skin Lesion &amp; Rash Classification System</w:t>
+            </w:r>
+          </w:p>
+        </w:tc>
+      </w:tr>
+      <w:tr>
+        <w:tc>
+          <w:tcPr>
+            <w:tcW w:type="dxa" w:w="4680"/>
+            <w:shd w:fill="F8FAFC"/>
+            <w:tcMar>
+              <w:top w:w="60" w:type="dxa"/>
+              <w:bottom w:w="60" w:type="dxa"/>
+              <w:left w:w="120" w:type="dxa"/>
+              <w:right w:w="120" w:type="dxa"/>
+            </w:tcMar>
+          </w:tcPr>
+          <w:p>
+            <w:r>
+              <w:rPr>
+                <w:b/>
+              </w:rPr>
+              <w:t>GitHub Repository</w:t>
+            </w:r>
+          </w:p>
+        </w:tc>
+        <w:tc>
+          <w:tcPr>
+            <w:tcW w:type="dxa" w:w="4680"/>
+            <w:shd w:fill="F8FAFC"/>
+            <w:tcMar>
+              <w:top w:w="60" w:type="dxa"/>
+              <w:bottom w:w="60" w:type="dxa"/>
+              <w:left w:w="120" w:type="dxa"/>
+              <w:right w:w="120" w:type="dxa"/>
+            </w:tcMar>
+          </w:tcPr>
+          <w:p>
+            <w:r>
+              <w:t>https://github.com/vijayesh26/Dermo-Scan-</w:t>
+            </w:r>
+          </w:p>
+        </w:tc>
+      </w:tr>
+      <w:tr>
+        <w:tc>
+          <w:tcPr>
+            <w:tcW w:type="dxa" w:w="4680"/>
+            <w:tcMar>
+              <w:top w:w="60" w:type="dxa"/>
+              <w:bottom w:w="60" w:type="dxa"/>
+              <w:left w:w="120" w:type="dxa"/>
+              <w:right w:w="120" w:type="dxa"/>
+            </w:tcMar>
+          </w:tcPr>
+          <w:p>
+            <w:r>
+              <w:rPr>
+                <w:b/>
+              </w:rPr>
+              <w:t>Live Web Application</w:t>
+            </w:r>
+          </w:p>
+        </w:tc>
+        <w:tc>
+          <w:tcPr>
+            <w:tcW w:type="dxa" w:w="4680"/>
+            <w:tcMar>
+              <w:top w:w="60" w:type="dxa"/>
+              <w:bottom w:w="60" w:type="dxa"/>
+              <w:left w:w="120" w:type="dxa"/>
+              <w:right w:w="120" w:type="dxa"/>
+            </w:tcMar>
+          </w:tcPr>
+          <w:p>
+            <w:r>
+              <w:t>https://dermo-scan-nesn.vercel.app/</w:t>
             </w:r>
           </w:p>
         </w:tc>
@@ -5894,6 +6097,49 @@
         </w:drawing>
       </w:r>
     </w:p>
+    <w:p>
+      <w:r>
+        <w:br w:type="page"/>
+      </w:r>
+    </w:p>
+    <w:p>
+      <w:pPr>
+        <w:keepNext/>
+        <w:spacing w:before="320" w:after="120"/>
+      </w:pPr>
+      <w:r>
+        <w:rPr>
+          <w:rFonts w:ascii="Georgia" w:hAnsi="Georgia"/>
+          <w:b/>
+          <w:color w:val="0F6FBF"/>
+          <w:sz w:val="28"/>
+        </w:rPr>
+        <w:t>Appendix M: Live Project Links for Interview Demonstration</w:t>
+      </w:r>
+    </w:p>
+    <w:p>
+      <w:r>
+        <w:t>The following deployed routes and repository resources are provided for project evaluation and technical interview demonstration:</w:t>
+        <w:br/>
+        <w:br/>
+        <w:t>• Live Web Application (Vercel): https://dermo-scan-nesn.vercel.app/</w:t>
+        <w:br/>
+        <w:t>• GitHub Source Code Repository: https://github.com/vijayesh26/Dermo-Scan-</w:t>
+        <w:br/>
+        <w:br/>
+        <w:t>Recommended Interview Demonstration Workflow:</w:t>
+        <w:br/>
+        <w:t>1. Ingestion: Open the live web application and demonstrate image drag-and-drop into the Cutaneous Specimen Intake Console on the right.</w:t>
+        <w:br/>
+        <w:t>2. Clinical Context: Configure anatomical zone, symptom duration, and patient sensation chips (Itchy, Burning, Painful).</w:t>
+        <w:br/>
+        <w:t>3. AI Classification: Click 'Run Diagnostic Scan' to trigger the client-side canvas downsampling and multimodal/heuristic inference.</w:t>
+        <w:br/>
+        <w:t>4. Diagnostic Dossier: Review the structured clinical dossier on the left, highlighting the #0F6FBF confidence meter, ICD-10 code, 4-quadrant morphology, and differential hierarchy.</w:t>
+        <w:br/>
+        <w:t>5. Audit Session History: Navigate to 'Scan History' to inspect previous session cases and demonstrate one-click dossier re-inspection.</w:t>
+      </w:r>
+    </w:p>
     <w:sectPr>
       <w:headerReference w:type="default" r:id="rId9"/>
       <w:footerReference w:type="default" r:id="rId10"/>

</xml_diff>

<commit_message>
Add live workstation screenshots to report and add 13-slide DermoScan presentation
</commit_message>
<xml_diff>
--- a/DERMO_SCAN_INDUSTRIAL_TRAINING_PROJECT_REPORT.docx
+++ b/DERMO_SCAN_INDUSTRIAL_TRAINING_PROJECT_REPORT.docx
@@ -4911,6 +4911,60 @@
     </w:p>
     <w:p>
       <w:pPr>
+        <w:spacing w:before="160" w:after="80"/>
+        <w:jc w:val="center"/>
+      </w:pPr>
+      <w:r>
+        <w:drawing>
+          <wp:inline xmlns:a="http://schemas.openxmlformats.org/drawingml/2006/main" xmlns:pic="http://schemas.openxmlformats.org/drawingml/2006/picture">
+            <wp:extent cx="5486400" cy="3086100"/>
+            <wp:docPr id="2" name="Picture 2"/>
+            <wp:cNvGraphicFramePr>
+              <a:graphicFrameLocks noChangeAspect="1"/>
+            </wp:cNvGraphicFramePr>
+            <a:graphic>
+              <a:graphicData uri="http://schemas.openxmlformats.org/drawingml/2006/picture">
+                <pic:pic>
+                  <pic:nvPicPr>
+                    <pic:cNvPr id="0" name="media_1793280759910_fa29019d.png"/>
+                    <pic:cNvPicPr/>
+                  </pic:nvPicPr>
+                  <pic:blipFill>
+                    <a:blip r:embed="rId12"/>
+                    <a:stretch>
+                      <a:fillRect/>
+                    </a:stretch>
+                  </pic:blipFill>
+                  <pic:spPr>
+                    <a:xfrm>
+                      <a:off x="0" y="0"/>
+                      <a:ext cx="5486400" cy="3086100"/>
+                    </a:xfrm>
+                    <a:prstGeom prst="rect"/>
+                  </pic:spPr>
+                </pic:pic>
+              </a:graphicData>
+            </a:graphic>
+          </wp:inline>
+        </w:drawing>
+      </w:r>
+    </w:p>
+    <w:p>
+      <w:pPr>
+        <w:spacing w:after="280"/>
+        <w:jc w:val="center"/>
+      </w:pPr>
+      <w:r>
+        <w:rPr>
+          <w:i/>
+          <w:color w:val="475569"/>
+          <w:sz w:val="19"/>
+        </w:rPr>
+        <w:t>Figure B.1: Live DermoScan Cutaneous Specimen Intake Console deployed at https://dermo-scan-nesn.vercel.app/ awaiting clinical specimen ingestion and contextual parameter selection.</w:t>
+      </w:r>
+    </w:p>
+    <w:p>
+      <w:pPr>
         <w:keepNext/>
         <w:spacing w:before="220" w:after="60"/>
       </w:pPr>
@@ -4969,6 +5023,60 @@
         <w:t>• Differential Diagnoses: Ranked alternatives with High, Moderate, and Low likelihood badges.</w:t>
         <w:br/>
         <w:t>• Clinical Guidance: Evidence-based self-care recommendations and explicit contraindications.</w:t>
+      </w:r>
+    </w:p>
+    <w:p>
+      <w:pPr>
+        <w:spacing w:before="160" w:after="80"/>
+        <w:jc w:val="center"/>
+      </w:pPr>
+      <w:r>
+        <w:drawing>
+          <wp:inline xmlns:a="http://schemas.openxmlformats.org/drawingml/2006/main" xmlns:pic="http://schemas.openxmlformats.org/drawingml/2006/picture">
+            <wp:extent cx="5486400" cy="3086100"/>
+            <wp:docPr id="3" name="Picture 3"/>
+            <wp:cNvGraphicFramePr>
+              <a:graphicFrameLocks noChangeAspect="1"/>
+            </wp:cNvGraphicFramePr>
+            <a:graphic>
+              <a:graphicData uri="http://schemas.openxmlformats.org/drawingml/2006/picture">
+                <pic:pic>
+                  <pic:nvPicPr>
+                    <pic:cNvPr id="0" name="media_1793280759965_157a41a0.png"/>
+                    <pic:cNvPicPr/>
+                  </pic:nvPicPr>
+                  <pic:blipFill>
+                    <a:blip r:embed="rId13"/>
+                    <a:stretch>
+                      <a:fillRect/>
+                    </a:stretch>
+                  </pic:blipFill>
+                  <pic:spPr>
+                    <a:xfrm>
+                      <a:off x="0" y="0"/>
+                      <a:ext cx="5486400" cy="3086100"/>
+                    </a:xfrm>
+                    <a:prstGeom prst="rect"/>
+                  </pic:spPr>
+                </pic:pic>
+              </a:graphicData>
+            </a:graphic>
+          </wp:inline>
+        </w:drawing>
+      </w:r>
+    </w:p>
+    <w:p>
+      <w:pPr>
+        <w:spacing w:after="280"/>
+        <w:jc w:val="center"/>
+      </w:pPr>
+      <w:r>
+        <w:rPr>
+          <w:i/>
+          <w:color w:val="475569"/>
+          <w:sz w:val="19"/>
+        </w:rPr>
+        <w:t>Figure D.1: Live Diagnostic Dossier &amp; Morphology Matrix deployed at https://dermo-scan-nesn.vercel.app/ displaying primary classification of Psoriasis Vulgaris (ICD-10 L40.0), 89% AI Pattern Confidence, 4-Quadrant Morphology metrics, and clinical protocol guidance.</w:t>
       </w:r>
     </w:p>
     <w:p>
@@ -5963,7 +6071,7 @@
         <w:drawing>
           <wp:inline xmlns:a="http://schemas.openxmlformats.org/drawingml/2006/main" xmlns:pic="http://schemas.openxmlformats.org/drawingml/2006/picture">
             <wp:extent cx="5120640" cy="7242363"/>
-            <wp:docPr id="2" name="Picture 2"/>
+            <wp:docPr id="4" name="Picture 4"/>
             <wp:cNvGraphicFramePr>
               <a:graphicFrameLocks noChangeAspect="1"/>
             </wp:cNvGraphicFramePr>
@@ -5975,7 +6083,7 @@
                     <pic:cNvPicPr/>
                   </pic:nvPicPr>
                   <pic:blipFill>
-                    <a:blip r:embed="rId12"/>
+                    <a:blip r:embed="rId14"/>
                     <a:stretch>
                       <a:fillRect/>
                     </a:stretch>
@@ -6066,7 +6174,7 @@
         <w:drawing>
           <wp:inline xmlns:a="http://schemas.openxmlformats.org/drawingml/2006/main" xmlns:pic="http://schemas.openxmlformats.org/drawingml/2006/picture">
             <wp:extent cx="5303520" cy="3977640"/>
-            <wp:docPr id="3" name="Picture 3"/>
+            <wp:docPr id="5" name="Picture 5"/>
             <wp:cNvGraphicFramePr>
               <a:graphicFrameLocks noChangeAspect="1"/>
             </wp:cNvGraphicFramePr>
@@ -6078,7 +6186,7 @@
                     <pic:cNvPicPr/>
                   </pic:nvPicPr>
                   <pic:blipFill>
-                    <a:blip r:embed="rId13"/>
+                    <a:blip r:embed="rId15"/>
                     <a:stretch>
                       <a:fillRect/>
                     </a:stretch>

</xml_diff>